<commit_message>
JW issue, PO template committed.
</commit_message>
<xml_diff>
--- a/APLOS/POPResources/Templates/JWIssue20202.docx
+++ b/APLOS/POPResources/Templates/JWIssue20202.docx
@@ -1240,7 +1240,27 @@
                 <w:sz w:val="16"/>
                 <w:szCs w:val="16"/>
               </w:rPr>
-              <w:t xml:space="preserve">Issue </w:t>
+              <w:t>Issue</w:t>
+            </w:r>
+            <w:r>
+              <w:rPr>
+                <w:rFonts w:ascii="Tahoma" w:hAnsi="Tahoma" w:cs="Tahoma"/>
+                <w:b/>
+                <w:color w:val="000000"/>
+                <w:sz w:val="16"/>
+                <w:szCs w:val="16"/>
+              </w:rPr>
+              <w:t>d</w:t>
+            </w:r>
+            <w:r>
+              <w:rPr>
+                <w:rFonts w:ascii="Tahoma" w:hAnsi="Tahoma" w:cs="Tahoma"/>
+                <w:b/>
+                <w:color w:val="000000"/>
+                <w:sz w:val="16"/>
+                <w:szCs w:val="16"/>
+              </w:rPr>
+              <w:t xml:space="preserve"> </w:t>
             </w:r>
             <w:proofErr w:type="gramStart"/>
             <w:r>
@@ -1251,7 +1271,7 @@
                 <w:sz w:val="16"/>
                 <w:szCs w:val="16"/>
               </w:rPr>
-              <w:t>By</w:t>
+              <w:t>To</w:t>
             </w:r>
             <w:r>
               <w:rPr>
@@ -2418,7 +2438,7 @@
                       </mc:Choice>
                       <mc:Fallback>
                         <w:pict>
-                          <v:line w14:anchorId="722AC056" id="Straight Connector 1" o:spid="_x0000_s1026" style="position:absolute;flip:x;z-index:251682816;visibility:visible;mso-wrap-style:square;mso-width-percent:0;mso-height-percent:0;mso-wrap-distance-left:9pt;mso-wrap-distance-top:0;mso-wrap-distance-right:9pt;mso-wrap-distance-bottom:0;mso-position-horizontal:absolute;mso-position-horizontal-relative:text;mso-position-vertical:absolute;mso-position-vertical-relative:text;mso-width-percent:0;mso-height-percent:0;mso-width-relative:margin;mso-height-relative:margin" from="30.2pt,8.35pt" to="139.75pt,8.35pt" o:gfxdata="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" strokecolor="black [3213]" strokeweight=".5pt">
+                          <v:line w14:anchorId="15135B11" id="Straight Connector 1" o:spid="_x0000_s1026" style="position:absolute;flip:x;z-index:251682816;visibility:visible;mso-wrap-style:square;mso-width-percent:0;mso-height-percent:0;mso-wrap-distance-left:9pt;mso-wrap-distance-top:0;mso-wrap-distance-right:9pt;mso-wrap-distance-bottom:0;mso-position-horizontal:absolute;mso-position-horizontal-relative:text;mso-position-vertical:absolute;mso-position-vertical-relative:text;mso-width-percent:0;mso-height-percent:0;mso-width-relative:margin;mso-height-relative:margin" from="30.2pt,8.35pt" to="139.75pt,8.35pt" o:gfxdata="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" strokecolor="black [3213]" strokeweight=".5pt">
                             <v:stroke joinstyle="miter"/>
                           </v:line>
                         </w:pict>
@@ -2539,7 +2559,7 @@
                       </mc:Choice>
                       <mc:Fallback>
                         <w:pict>
-                          <v:line w14:anchorId="0F267564" id="Straight Connector 2" o:spid="_x0000_s1026" style="position:absolute;z-index:251685888;visibility:visible;mso-wrap-style:square;mso-wrap-distance-left:9pt;mso-wrap-distance-top:0;mso-wrap-distance-right:9pt;mso-wrap-distance-bottom:0;mso-position-horizontal:absolute;mso-position-horizontal-relative:text;mso-position-vertical:absolute;mso-position-vertical-relative:text" from="31.2pt,8.35pt" to="143.25pt,8.35pt" o:gfxdata="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" strokecolor="black [3213]" strokeweight=".5pt">
+                          <v:line w14:anchorId="16F0BE0A" id="Straight Connector 2" o:spid="_x0000_s1026" style="position:absolute;z-index:251685888;visibility:visible;mso-wrap-style:square;mso-wrap-distance-left:9pt;mso-wrap-distance-top:0;mso-wrap-distance-right:9pt;mso-wrap-distance-bottom:0;mso-position-horizontal:absolute;mso-position-horizontal-relative:text;mso-position-vertical:absolute;mso-position-vertical-relative:text" from="31.2pt,8.35pt" to="143.25pt,8.35pt" o:gfxdata="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" strokecolor="black [3213]" strokeweight=".5pt">
                             <v:stroke joinstyle="miter"/>
                           </v:line>
                         </w:pict>
@@ -2670,7 +2690,7 @@
                       </mc:Choice>
                       <mc:Fallback>
                         <w:pict>
-                          <v:line w14:anchorId="68A85112" id="Straight Connector 3" o:spid="_x0000_s1026" style="position:absolute;z-index:251683840;visibility:visible;mso-wrap-style:square;mso-width-percent:0;mso-wrap-distance-left:9pt;mso-wrap-distance-top:0;mso-wrap-distance-right:9pt;mso-wrap-distance-bottom:0;mso-position-horizontal:absolute;mso-position-horizontal-relative:text;mso-position-vertical:absolute;mso-position-vertical-relative:text;mso-width-percent:0;mso-width-relative:margin" from="23.5pt,8.35pt" to="143.7pt,8.35pt" o:gfxdata="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" strokecolor="black [3213]" strokeweight=".5pt">
+                          <v:line w14:anchorId="67642DD3" id="Straight Connector 3" o:spid="_x0000_s1026" style="position:absolute;z-index:251683840;visibility:visible;mso-wrap-style:square;mso-width-percent:0;mso-wrap-distance-left:9pt;mso-wrap-distance-top:0;mso-wrap-distance-right:9pt;mso-wrap-distance-bottom:0;mso-position-horizontal:absolute;mso-position-horizontal-relative:text;mso-position-vertical:absolute;mso-position-vertical-relative:text;mso-width-percent:0;mso-width-relative:margin" from="23.5pt,8.35pt" to="143.7pt,8.35pt" o:gfxdata="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" strokecolor="black [3213]" strokeweight=".5pt">
                             <v:stroke joinstyle="miter"/>
                           </v:line>
                         </w:pict>
@@ -2789,7 +2809,7 @@
                       </mc:Choice>
                       <mc:Fallback>
                         <w:pict>
-                          <v:line w14:anchorId="4595427E" id="Straight Connector 5" o:spid="_x0000_s1026" style="position:absolute;z-index:251684864;visibility:visible;mso-wrap-style:square;mso-wrap-distance-left:9pt;mso-wrap-distance-top:0;mso-wrap-distance-right:9pt;mso-wrap-distance-bottom:0;mso-position-horizontal:absolute;mso-position-horizontal-relative:text;mso-position-vertical:absolute;mso-position-vertical-relative:text" from="31.2pt,8.35pt" to="143.25pt,8.35pt" o:gfxdata="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" strokecolor="black [3213]" strokeweight=".5pt">
+                          <v:line w14:anchorId="6BF62CFC" id="Straight Connector 5" o:spid="_x0000_s1026" style="position:absolute;z-index:251684864;visibility:visible;mso-wrap-style:square;mso-wrap-distance-left:9pt;mso-wrap-distance-top:0;mso-wrap-distance-right:9pt;mso-wrap-distance-bottom:0;mso-position-horizontal:absolute;mso-position-horizontal-relative:text;mso-position-vertical:absolute;mso-position-vertical-relative:text" from="31.2pt,8.35pt" to="143.25pt,8.35pt" o:gfxdata="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" strokecolor="black [3213]" strokeweight=".5pt">
                             <v:stroke joinstyle="miter"/>
                           </v:line>
                         </w:pict>
@@ -3091,123 +3111,70 @@
   </w:sdt>
   <w:p>
     <w:pPr>
-      <w:jc w:val="center"/>
+      <w:rPr>
+        <w:rFonts w:ascii="Tahoma" w:eastAsia="Times New Roman" w:hAnsi="Tahoma" w:cs="Tahoma"/>
+        <w:sz w:val="16"/>
+        <w:szCs w:val="16"/>
+        <w:lang w:val="en-IN" w:eastAsia="en-IN"/>
+      </w:rPr>
     </w:pPr>
     <w:r>
       <w:rPr>
-        <w:rFonts w:ascii="Tahoma" w:hAnsi="Tahoma" w:cs="Tahoma"/>
+        <w:rFonts w:ascii="Segoe UI" w:eastAsia="Times New Roman" w:hAnsi="Segoe UI" w:cs="Segoe UI"/>
+        <w:sz w:val="21"/>
+        <w:szCs w:val="21"/>
+        <w:lang w:val="en-IN" w:eastAsia="en-IN"/>
+      </w:rPr>
+      <w:t xml:space="preserve">                                                                                                               </w:t>
+    </w:r>
+    <w:r>
+      <w:rPr>
+        <w:rFonts w:ascii="Tahoma" w:eastAsia="Times New Roman" w:hAnsi="Tahoma" w:cs="Tahoma"/>
         <w:sz w:val="16"/>
         <w:szCs w:val="16"/>
+        <w:lang w:val="en-IN" w:eastAsia="en-IN"/>
       </w:rPr>
-      <w:t xml:space="preserve">Mouza: </w:t>
+      <w:t xml:space="preserve">P.S: </w:t>
     </w:r>
     <w:proofErr w:type="spellStart"/>
     <w:r>
       <w:rPr>
-        <w:rFonts w:ascii="Tahoma" w:hAnsi="Tahoma" w:cs="Tahoma"/>
+        <w:rFonts w:ascii="Tahoma" w:eastAsia="Times New Roman" w:hAnsi="Tahoma" w:cs="Tahoma"/>
         <w:sz w:val="16"/>
         <w:szCs w:val="16"/>
+        <w:lang w:val="en-IN" w:eastAsia="en-IN"/>
       </w:rPr>
-      <w:t>Depashai</w:t>
+      <w:t>Kaliakair</w:t>
     </w:r>
     <w:proofErr w:type="spellEnd"/>
     <w:r>
       <w:rPr>
-        <w:rFonts w:ascii="Tahoma" w:hAnsi="Tahoma" w:cs="Tahoma"/>
+        <w:rFonts w:ascii="Tahoma" w:eastAsia="Times New Roman" w:hAnsi="Tahoma" w:cs="Tahoma"/>
         <w:sz w:val="16"/>
         <w:szCs w:val="16"/>
+        <w:lang w:val="en-IN" w:eastAsia="en-IN"/>
       </w:rPr>
-      <w:t xml:space="preserve">, </w:t>
+      <w:t xml:space="preserve"> District: Gazipur-</w:t>
     </w:r>
     <w:proofErr w:type="gramStart"/>
     <w:r>
       <w:rPr>
-        <w:rFonts w:ascii="Tahoma" w:hAnsi="Tahoma" w:cs="Tahoma"/>
+        <w:rFonts w:ascii="Tahoma" w:eastAsia="Times New Roman" w:hAnsi="Tahoma" w:cs="Tahoma"/>
         <w:sz w:val="16"/>
         <w:szCs w:val="16"/>
+        <w:lang w:val="en-IN" w:eastAsia="en-IN"/>
       </w:rPr>
-      <w:t>U.P</w:t>
+      <w:t>1751,Bangladesh</w:t>
     </w:r>
     <w:proofErr w:type="gramEnd"/>
     <w:r>
       <w:rPr>
-        <w:rFonts w:ascii="Tahoma" w:hAnsi="Tahoma" w:cs="Tahoma"/>
+        <w:rFonts w:ascii="Tahoma" w:eastAsia="Times New Roman" w:hAnsi="Tahoma" w:cs="Tahoma"/>
         <w:sz w:val="16"/>
         <w:szCs w:val="16"/>
+        <w:lang w:val="en-IN" w:eastAsia="en-IN"/>
       </w:rPr>
-      <w:t xml:space="preserve">: </w:t>
-    </w:r>
-    <w:proofErr w:type="spellStart"/>
-    <w:r>
-      <w:rPr>
-        <w:rFonts w:ascii="Tahoma" w:hAnsi="Tahoma" w:cs="Tahoma"/>
-        <w:sz w:val="16"/>
-        <w:szCs w:val="16"/>
-      </w:rPr>
-      <w:t>Sombag</w:t>
-    </w:r>
-    <w:proofErr w:type="spellEnd"/>
-    <w:r>
-      <w:rPr>
-        <w:rFonts w:ascii="Tahoma" w:hAnsi="Tahoma" w:cs="Tahoma"/>
-        <w:sz w:val="16"/>
-        <w:szCs w:val="16"/>
-      </w:rPr>
-      <w:t xml:space="preserve">, </w:t>
-    </w:r>
-    <w:proofErr w:type="spellStart"/>
-    <w:r>
-      <w:rPr>
-        <w:rFonts w:ascii="Tahoma" w:hAnsi="Tahoma" w:cs="Tahoma"/>
-        <w:sz w:val="16"/>
-        <w:szCs w:val="16"/>
-      </w:rPr>
-      <w:t>Kalampur</w:t>
-    </w:r>
-    <w:proofErr w:type="spellEnd"/>
-    <w:r>
-      <w:rPr>
-        <w:rFonts w:ascii="Tahoma" w:hAnsi="Tahoma" w:cs="Tahoma"/>
-        <w:sz w:val="16"/>
-        <w:szCs w:val="16"/>
-      </w:rPr>
-      <w:t xml:space="preserve">, P.S: </w:t>
-    </w:r>
-    <w:proofErr w:type="spellStart"/>
-    <w:r>
-      <w:rPr>
-        <w:rFonts w:ascii="Tahoma" w:hAnsi="Tahoma" w:cs="Tahoma"/>
-        <w:sz w:val="16"/>
-        <w:szCs w:val="16"/>
-      </w:rPr>
-      <w:t>Dhamrai</w:t>
-    </w:r>
-    <w:proofErr w:type="spellEnd"/>
-    <w:r>
-      <w:rPr>
-        <w:rFonts w:ascii="Tahoma" w:hAnsi="Tahoma" w:cs="Tahoma"/>
-        <w:sz w:val="16"/>
-        <w:szCs w:val="16"/>
-      </w:rPr>
-      <w:t xml:space="preserve"> District: Dhaka, </w:t>
-    </w:r>
-    <w:proofErr w:type="spellStart"/>
-    <w:r>
-      <w:rPr>
-        <w:rFonts w:ascii="Tahoma" w:hAnsi="Tahoma" w:cs="Tahoma"/>
-        <w:sz w:val="16"/>
-        <w:szCs w:val="16"/>
-      </w:rPr>
-      <w:t>Bangladesh.Web</w:t>
-    </w:r>
-    <w:proofErr w:type="spellEnd"/>
-    <w:r>
-      <w:rPr>
-        <w:rFonts w:ascii="Tahoma" w:hAnsi="Tahoma" w:cs="Tahoma"/>
-        <w:sz w:val="16"/>
-        <w:szCs w:val="16"/>
-      </w:rPr>
-      <w:t>: www.ocl-bd.com Phone: +8809612223355</w:t>
+      <w:t>.</w:t>
     </w:r>
   </w:p>
 </w:ftr>

</xml_diff>